<commit_message>
test(performance): refactor login load test structure and update results artifacts
</commit_message>
<xml_diff>
--- a/InformeResultados-Punto 2 Performance.docx
+++ b/InformeResultados-Punto 2 Performance.docx
@@ -4,567 +4,1525 @@
   <w:body>
     <w:p>
       <w:pPr>
+        <w:jc w:val="center"/>
         <w:rPr>
           <w:rFonts w:asciiTheme="majorHAnsi" w:hAnsiTheme="majorHAnsi" w:cstheme="majorHAnsi"/>
+          <w:sz w:val="24"/>
+          <w:szCs w:val="24"/>
+        </w:rPr>
+      </w:pPr>
+      <w:r>
+        <w:rPr>
+          <w:rFonts w:asciiTheme="majorHAnsi" w:hAnsiTheme="majorHAnsi" w:cstheme="majorHAnsi"/>
+          <w:b/>
+          <w:sz w:val="24"/>
+          <w:szCs w:val="24"/>
+        </w:rPr>
+        <w:t>INFORME DE RESULTADOS – PRUEBA DE PERFORMANCE</w:t>
+      </w:r>
+    </w:p>
+    <w:p>
+      <w:pPr>
+        <w:pStyle w:val="Ttulo1"/>
+        <w:rPr>
+          <w:rFonts w:cstheme="majorHAnsi"/>
+          <w:color w:val="auto"/>
+          <w:sz w:val="24"/>
+          <w:szCs w:val="24"/>
+        </w:rPr>
+      </w:pPr>
+      <w:r>
+        <w:rPr>
+          <w:rFonts w:cstheme="majorHAnsi"/>
+          <w:color w:val="auto"/>
+          <w:sz w:val="24"/>
+          <w:szCs w:val="24"/>
+        </w:rPr>
+        <w:t>1. Objetivo</w:t>
+      </w:r>
+    </w:p>
+    <w:p>
+      <w:pPr>
+        <w:spacing w:after="120"/>
+        <w:rPr>
+          <w:rFonts w:asciiTheme="majorHAnsi" w:hAnsiTheme="majorHAnsi" w:cstheme="majorHAnsi"/>
+          <w:sz w:val="24"/>
+          <w:szCs w:val="24"/>
+        </w:rPr>
+      </w:pPr>
+      <w:r>
+        <w:rPr>
+          <w:rFonts w:asciiTheme="majorHAnsi" w:hAnsiTheme="majorHAnsi" w:cstheme="majorHAnsi"/>
+          <w:sz w:val="24"/>
+          <w:szCs w:val="24"/>
+        </w:rPr>
+        <w:t>Presentar los hallazgos, conclusiones y recomendaciones derivados del resumen de resultados y del gráfico de monitoreo de la prueba de carga. El análisis se enfoca en la relación entre usuarios virtuales, tasa de peticiones por segundo, tiempos de respuesta y errores observados.</w:t>
+      </w:r>
+    </w:p>
+    <w:p>
+      <w:pPr>
+        <w:pStyle w:val="Ttulo1"/>
+        <w:rPr>
+          <w:rFonts w:cstheme="majorHAnsi"/>
+          <w:color w:val="auto"/>
+          <w:sz w:val="24"/>
+          <w:szCs w:val="24"/>
+        </w:rPr>
+      </w:pPr>
+      <w:r>
+        <w:rPr>
+          <w:rFonts w:cstheme="majorHAnsi"/>
+          <w:color w:val="auto"/>
+          <w:sz w:val="24"/>
+          <w:szCs w:val="24"/>
+        </w:rPr>
+        <w:t>2. Resumen de métricas observadas</w:t>
+      </w:r>
+    </w:p>
+    <w:tbl>
+      <w:tblPr>
+        <w:tblStyle w:val="Tablaconcuadrcula"/>
+        <w:tblW w:w="0" w:type="auto"/>
+        <w:jc w:val="center"/>
+        <w:tblLook w:val="04A0" w:firstRow="1" w:lastRow="0" w:firstColumn="1" w:lastColumn="0" w:noHBand="0" w:noVBand="1"/>
+      </w:tblPr>
+      <w:tblGrid>
+        <w:gridCol w:w="2381"/>
+        <w:gridCol w:w="2721"/>
+        <w:gridCol w:w="3969"/>
+      </w:tblGrid>
+      <w:tr>
+        <w:trPr>
+          <w:jc w:val="center"/>
+        </w:trPr>
+        <w:tc>
+          <w:tcPr>
+            <w:tcW w:w="2381" w:type="dxa"/>
+            <w:shd w:val="clear" w:color="auto" w:fill="124D64"/>
+            <w:tcMar>
+              <w:top w:w="110" w:type="dxa"/>
+              <w:left w:w="110" w:type="dxa"/>
+              <w:bottom w:w="110" w:type="dxa"/>
+              <w:right w:w="110" w:type="dxa"/>
+            </w:tcMar>
+            <w:vAlign w:val="center"/>
+          </w:tcPr>
+          <w:p>
+            <w:pPr>
+              <w:jc w:val="center"/>
+              <w:rPr>
+                <w:rFonts w:asciiTheme="majorHAnsi" w:hAnsiTheme="majorHAnsi" w:cstheme="majorHAnsi"/>
+                <w:sz w:val="24"/>
+                <w:szCs w:val="24"/>
+              </w:rPr>
+            </w:pPr>
+            <w:r>
+              <w:rPr>
+                <w:rFonts w:asciiTheme="majorHAnsi" w:hAnsiTheme="majorHAnsi" w:cstheme="majorHAnsi"/>
+                <w:b/>
+                <w:sz w:val="24"/>
+                <w:szCs w:val="24"/>
+              </w:rPr>
+              <w:t>Indicador</w:t>
+            </w:r>
+          </w:p>
+        </w:tc>
+        <w:tc>
+          <w:tcPr>
+            <w:tcW w:w="2721" w:type="dxa"/>
+            <w:shd w:val="clear" w:color="auto" w:fill="124D64"/>
+            <w:tcMar>
+              <w:top w:w="110" w:type="dxa"/>
+              <w:left w:w="110" w:type="dxa"/>
+              <w:bottom w:w="110" w:type="dxa"/>
+              <w:right w:w="110" w:type="dxa"/>
+            </w:tcMar>
+            <w:vAlign w:val="center"/>
+          </w:tcPr>
+          <w:p>
+            <w:pPr>
+              <w:jc w:val="center"/>
+              <w:rPr>
+                <w:rFonts w:asciiTheme="majorHAnsi" w:hAnsiTheme="majorHAnsi" w:cstheme="majorHAnsi"/>
+                <w:sz w:val="24"/>
+                <w:szCs w:val="24"/>
+              </w:rPr>
+            </w:pPr>
+            <w:r>
+              <w:rPr>
+                <w:rFonts w:asciiTheme="majorHAnsi" w:hAnsiTheme="majorHAnsi" w:cstheme="majorHAnsi"/>
+                <w:b/>
+                <w:sz w:val="24"/>
+                <w:szCs w:val="24"/>
+              </w:rPr>
+              <w:t>Valor observado</w:t>
+            </w:r>
+          </w:p>
+        </w:tc>
+        <w:tc>
+          <w:tcPr>
+            <w:tcW w:w="3969" w:type="dxa"/>
+            <w:shd w:val="clear" w:color="auto" w:fill="124D64"/>
+            <w:tcMar>
+              <w:top w:w="110" w:type="dxa"/>
+              <w:left w:w="110" w:type="dxa"/>
+              <w:bottom w:w="110" w:type="dxa"/>
+              <w:right w:w="110" w:type="dxa"/>
+            </w:tcMar>
+            <w:vAlign w:val="center"/>
+          </w:tcPr>
+          <w:p>
+            <w:pPr>
+              <w:jc w:val="center"/>
+              <w:rPr>
+                <w:rFonts w:asciiTheme="majorHAnsi" w:hAnsiTheme="majorHAnsi" w:cstheme="majorHAnsi"/>
+                <w:sz w:val="24"/>
+                <w:szCs w:val="24"/>
+              </w:rPr>
+            </w:pPr>
+            <w:r>
+              <w:rPr>
+                <w:rFonts w:asciiTheme="majorHAnsi" w:hAnsiTheme="majorHAnsi" w:cstheme="majorHAnsi"/>
+                <w:b/>
+                <w:sz w:val="24"/>
+                <w:szCs w:val="24"/>
+              </w:rPr>
+              <w:t>Interpretación</w:t>
+            </w:r>
+          </w:p>
+        </w:tc>
+      </w:tr>
+      <w:tr>
+        <w:trPr>
+          <w:jc w:val="center"/>
+        </w:trPr>
+        <w:tc>
+          <w:tcPr>
+            <w:tcW w:w="2381" w:type="dxa"/>
+            <w:tcMar>
+              <w:top w:w="110" w:type="dxa"/>
+              <w:left w:w="110" w:type="dxa"/>
+              <w:bottom w:w="110" w:type="dxa"/>
+              <w:right w:w="110" w:type="dxa"/>
+            </w:tcMar>
+            <w:vAlign w:val="center"/>
+          </w:tcPr>
+          <w:p>
+            <w:pPr>
+              <w:rPr>
+                <w:rFonts w:asciiTheme="majorHAnsi" w:hAnsiTheme="majorHAnsi" w:cstheme="majorHAnsi"/>
+                <w:sz w:val="24"/>
+                <w:szCs w:val="24"/>
+              </w:rPr>
+            </w:pPr>
+            <w:r>
+              <w:rPr>
+                <w:rFonts w:asciiTheme="majorHAnsi" w:hAnsiTheme="majorHAnsi" w:cstheme="majorHAnsi"/>
+                <w:sz w:val="24"/>
+                <w:szCs w:val="24"/>
+              </w:rPr>
+              <w:t xml:space="preserve">Checks </w:t>
+            </w:r>
+            <w:proofErr w:type="spellStart"/>
+            <w:r>
+              <w:rPr>
+                <w:rFonts w:asciiTheme="majorHAnsi" w:hAnsiTheme="majorHAnsi" w:cstheme="majorHAnsi"/>
+                <w:sz w:val="24"/>
+                <w:szCs w:val="24"/>
+              </w:rPr>
+              <w:t>exitosos</w:t>
+            </w:r>
+            <w:proofErr w:type="spellEnd"/>
+          </w:p>
+        </w:tc>
+        <w:tc>
+          <w:tcPr>
+            <w:tcW w:w="2721" w:type="dxa"/>
+            <w:tcMar>
+              <w:top w:w="110" w:type="dxa"/>
+              <w:left w:w="110" w:type="dxa"/>
+              <w:bottom w:w="110" w:type="dxa"/>
+              <w:right w:w="110" w:type="dxa"/>
+            </w:tcMar>
+            <w:vAlign w:val="center"/>
+          </w:tcPr>
+          <w:p>
+            <w:pPr>
+              <w:rPr>
+                <w:rFonts w:asciiTheme="majorHAnsi" w:hAnsiTheme="majorHAnsi" w:cstheme="majorHAnsi"/>
+                <w:sz w:val="24"/>
+                <w:szCs w:val="24"/>
+              </w:rPr>
+            </w:pPr>
+            <w:r>
+              <w:rPr>
+                <w:rFonts w:asciiTheme="majorHAnsi" w:hAnsiTheme="majorHAnsi" w:cstheme="majorHAnsi"/>
+                <w:sz w:val="24"/>
+                <w:szCs w:val="24"/>
+              </w:rPr>
+              <w:t>97.55% (269,891)</w:t>
+            </w:r>
+          </w:p>
+        </w:tc>
+        <w:tc>
+          <w:tcPr>
+            <w:tcW w:w="3969" w:type="dxa"/>
+            <w:tcMar>
+              <w:top w:w="110" w:type="dxa"/>
+              <w:left w:w="110" w:type="dxa"/>
+              <w:bottom w:w="110" w:type="dxa"/>
+              <w:right w:w="110" w:type="dxa"/>
+            </w:tcMar>
+            <w:vAlign w:val="center"/>
+          </w:tcPr>
+          <w:p>
+            <w:pPr>
+              <w:rPr>
+                <w:rFonts w:asciiTheme="majorHAnsi" w:hAnsiTheme="majorHAnsi" w:cstheme="majorHAnsi"/>
+                <w:sz w:val="24"/>
+                <w:szCs w:val="24"/>
+              </w:rPr>
+            </w:pPr>
+            <w:r>
+              <w:rPr>
+                <w:rFonts w:asciiTheme="majorHAnsi" w:hAnsiTheme="majorHAnsi" w:cstheme="majorHAnsi"/>
+                <w:sz w:val="24"/>
+                <w:szCs w:val="24"/>
+              </w:rPr>
+              <w:t>La mayoría de validaciones terminó correctamente.</w:t>
+            </w:r>
+          </w:p>
+        </w:tc>
+      </w:tr>
+      <w:tr>
+        <w:trPr>
+          <w:jc w:val="center"/>
+        </w:trPr>
+        <w:tc>
+          <w:tcPr>
+            <w:tcW w:w="2381" w:type="dxa"/>
+            <w:tcMar>
+              <w:top w:w="110" w:type="dxa"/>
+              <w:left w:w="110" w:type="dxa"/>
+              <w:bottom w:w="110" w:type="dxa"/>
+              <w:right w:w="110" w:type="dxa"/>
+            </w:tcMar>
+            <w:vAlign w:val="center"/>
+          </w:tcPr>
+          <w:p>
+            <w:pPr>
+              <w:rPr>
+                <w:rFonts w:asciiTheme="majorHAnsi" w:hAnsiTheme="majorHAnsi" w:cstheme="majorHAnsi"/>
+                <w:sz w:val="24"/>
+                <w:szCs w:val="24"/>
+              </w:rPr>
+            </w:pPr>
+            <w:proofErr w:type="spellStart"/>
+            <w:r>
+              <w:rPr>
+                <w:rFonts w:asciiTheme="majorHAnsi" w:hAnsiTheme="majorHAnsi" w:cstheme="majorHAnsi"/>
+                <w:sz w:val="24"/>
+                <w:szCs w:val="24"/>
+              </w:rPr>
+              <w:t>Errores</w:t>
+            </w:r>
+            <w:proofErr w:type="spellEnd"/>
+            <w:r>
+              <w:rPr>
+                <w:rFonts w:asciiTheme="majorHAnsi" w:hAnsiTheme="majorHAnsi" w:cstheme="majorHAnsi"/>
+                <w:sz w:val="24"/>
+                <w:szCs w:val="24"/>
+              </w:rPr>
+              <w:t xml:space="preserve"> / requests </w:t>
+            </w:r>
+            <w:proofErr w:type="spellStart"/>
+            <w:r>
+              <w:rPr>
+                <w:rFonts w:asciiTheme="majorHAnsi" w:hAnsiTheme="majorHAnsi" w:cstheme="majorHAnsi"/>
+                <w:sz w:val="24"/>
+                <w:szCs w:val="24"/>
+              </w:rPr>
+              <w:t>fallidos</w:t>
+            </w:r>
+            <w:proofErr w:type="spellEnd"/>
+          </w:p>
+        </w:tc>
+        <w:tc>
+          <w:tcPr>
+            <w:tcW w:w="2721" w:type="dxa"/>
+            <w:tcMar>
+              <w:top w:w="110" w:type="dxa"/>
+              <w:left w:w="110" w:type="dxa"/>
+              <w:bottom w:w="110" w:type="dxa"/>
+              <w:right w:w="110" w:type="dxa"/>
+            </w:tcMar>
+            <w:vAlign w:val="center"/>
+          </w:tcPr>
+          <w:p>
+            <w:pPr>
+              <w:rPr>
+                <w:rFonts w:asciiTheme="majorHAnsi" w:hAnsiTheme="majorHAnsi" w:cstheme="majorHAnsi"/>
+                <w:sz w:val="24"/>
+                <w:szCs w:val="24"/>
+              </w:rPr>
+            </w:pPr>
+            <w:r>
+              <w:rPr>
+                <w:rFonts w:asciiTheme="majorHAnsi" w:hAnsiTheme="majorHAnsi" w:cstheme="majorHAnsi"/>
+                <w:sz w:val="24"/>
+                <w:szCs w:val="24"/>
+              </w:rPr>
+              <w:t>2.44% (~6,759)</w:t>
+            </w:r>
+          </w:p>
+        </w:tc>
+        <w:tc>
+          <w:tcPr>
+            <w:tcW w:w="3969" w:type="dxa"/>
+            <w:tcMar>
+              <w:top w:w="110" w:type="dxa"/>
+              <w:left w:w="110" w:type="dxa"/>
+              <w:bottom w:w="110" w:type="dxa"/>
+              <w:right w:w="110" w:type="dxa"/>
+            </w:tcMar>
+            <w:vAlign w:val="center"/>
+          </w:tcPr>
+          <w:p>
+            <w:pPr>
+              <w:rPr>
+                <w:rFonts w:asciiTheme="majorHAnsi" w:hAnsiTheme="majorHAnsi" w:cstheme="majorHAnsi"/>
+                <w:sz w:val="24"/>
+                <w:szCs w:val="24"/>
+              </w:rPr>
+            </w:pPr>
+            <w:r>
+              <w:rPr>
+                <w:rFonts w:asciiTheme="majorHAnsi" w:hAnsiTheme="majorHAnsi" w:cstheme="majorHAnsi"/>
+                <w:sz w:val="24"/>
+                <w:szCs w:val="24"/>
+              </w:rPr>
+              <w:t>Existe afectación funcional visible, pero no generalizada.</w:t>
+            </w:r>
+          </w:p>
+        </w:tc>
+      </w:tr>
+      <w:tr>
+        <w:trPr>
+          <w:jc w:val="center"/>
+        </w:trPr>
+        <w:tc>
+          <w:tcPr>
+            <w:tcW w:w="2381" w:type="dxa"/>
+            <w:tcMar>
+              <w:top w:w="110" w:type="dxa"/>
+              <w:left w:w="110" w:type="dxa"/>
+              <w:bottom w:w="110" w:type="dxa"/>
+              <w:right w:w="110" w:type="dxa"/>
+            </w:tcMar>
+            <w:vAlign w:val="center"/>
+          </w:tcPr>
+          <w:p>
+            <w:pPr>
+              <w:rPr>
+                <w:rFonts w:asciiTheme="majorHAnsi" w:hAnsiTheme="majorHAnsi" w:cstheme="majorHAnsi"/>
+                <w:sz w:val="24"/>
+                <w:szCs w:val="24"/>
+              </w:rPr>
+            </w:pPr>
+            <w:proofErr w:type="spellStart"/>
+            <w:r>
+              <w:rPr>
+                <w:rFonts w:asciiTheme="majorHAnsi" w:hAnsiTheme="majorHAnsi" w:cstheme="majorHAnsi"/>
+                <w:sz w:val="24"/>
+                <w:szCs w:val="24"/>
+              </w:rPr>
+              <w:t>http_reqs</w:t>
+            </w:r>
+            <w:proofErr w:type="spellEnd"/>
+          </w:p>
+        </w:tc>
+        <w:tc>
+          <w:tcPr>
+            <w:tcW w:w="2721" w:type="dxa"/>
+            <w:tcMar>
+              <w:top w:w="110" w:type="dxa"/>
+              <w:left w:w="110" w:type="dxa"/>
+              <w:bottom w:w="110" w:type="dxa"/>
+              <w:right w:w="110" w:type="dxa"/>
+            </w:tcMar>
+            <w:vAlign w:val="center"/>
+          </w:tcPr>
+          <w:p>
+            <w:pPr>
+              <w:rPr>
+                <w:rFonts w:asciiTheme="majorHAnsi" w:hAnsiTheme="majorHAnsi" w:cstheme="majorHAnsi"/>
+                <w:sz w:val="24"/>
+                <w:szCs w:val="24"/>
+              </w:rPr>
+            </w:pPr>
+            <w:r>
+              <w:rPr>
+                <w:rFonts w:asciiTheme="majorHAnsi" w:hAnsiTheme="majorHAnsi" w:cstheme="majorHAnsi"/>
+                <w:sz w:val="24"/>
+                <w:szCs w:val="24"/>
+              </w:rPr>
+              <w:t>276,650 requests – 73.18 req/s</w:t>
+            </w:r>
+          </w:p>
+        </w:tc>
+        <w:tc>
+          <w:tcPr>
+            <w:tcW w:w="3969" w:type="dxa"/>
+            <w:tcMar>
+              <w:top w:w="110" w:type="dxa"/>
+              <w:left w:w="110" w:type="dxa"/>
+              <w:bottom w:w="110" w:type="dxa"/>
+              <w:right w:w="110" w:type="dxa"/>
+            </w:tcMar>
+            <w:vAlign w:val="center"/>
+          </w:tcPr>
+          <w:p>
+            <w:pPr>
+              <w:rPr>
+                <w:rFonts w:asciiTheme="majorHAnsi" w:hAnsiTheme="majorHAnsi" w:cstheme="majorHAnsi"/>
+                <w:sz w:val="24"/>
+                <w:szCs w:val="24"/>
+              </w:rPr>
+            </w:pPr>
+            <w:r>
+              <w:rPr>
+                <w:rFonts w:asciiTheme="majorHAnsi" w:hAnsiTheme="majorHAnsi" w:cstheme="majorHAnsi"/>
+                <w:sz w:val="24"/>
+                <w:szCs w:val="24"/>
+              </w:rPr>
+              <w:t>Se mantuvo un volumen de tráfico relevante durante la ejecución.</w:t>
+            </w:r>
+          </w:p>
+        </w:tc>
+      </w:tr>
+      <w:tr>
+        <w:trPr>
+          <w:jc w:val="center"/>
+        </w:trPr>
+        <w:tc>
+          <w:tcPr>
+            <w:tcW w:w="2381" w:type="dxa"/>
+            <w:tcMar>
+              <w:top w:w="110" w:type="dxa"/>
+              <w:left w:w="110" w:type="dxa"/>
+              <w:bottom w:w="110" w:type="dxa"/>
+              <w:right w:w="110" w:type="dxa"/>
+            </w:tcMar>
+            <w:vAlign w:val="center"/>
+          </w:tcPr>
+          <w:p>
+            <w:pPr>
+              <w:rPr>
+                <w:rFonts w:asciiTheme="majorHAnsi" w:hAnsiTheme="majorHAnsi" w:cstheme="majorHAnsi"/>
+                <w:sz w:val="24"/>
+                <w:szCs w:val="24"/>
+              </w:rPr>
+            </w:pPr>
+            <w:r>
+              <w:rPr>
+                <w:rFonts w:asciiTheme="majorHAnsi" w:hAnsiTheme="majorHAnsi" w:cstheme="majorHAnsi"/>
+                <w:sz w:val="24"/>
+                <w:szCs w:val="24"/>
+              </w:rPr>
+              <w:t xml:space="preserve">VUs </w:t>
+            </w:r>
+            <w:proofErr w:type="spellStart"/>
+            <w:r>
+              <w:rPr>
+                <w:rFonts w:asciiTheme="majorHAnsi" w:hAnsiTheme="majorHAnsi" w:cstheme="majorHAnsi"/>
+                <w:sz w:val="24"/>
+                <w:szCs w:val="24"/>
+              </w:rPr>
+              <w:t>máximos</w:t>
+            </w:r>
+            <w:proofErr w:type="spellEnd"/>
+          </w:p>
+        </w:tc>
+        <w:tc>
+          <w:tcPr>
+            <w:tcW w:w="2721" w:type="dxa"/>
+            <w:tcMar>
+              <w:top w:w="110" w:type="dxa"/>
+              <w:left w:w="110" w:type="dxa"/>
+              <w:bottom w:w="110" w:type="dxa"/>
+              <w:right w:w="110" w:type="dxa"/>
+            </w:tcMar>
+            <w:vAlign w:val="center"/>
+          </w:tcPr>
+          <w:p>
+            <w:pPr>
+              <w:rPr>
+                <w:rFonts w:asciiTheme="majorHAnsi" w:hAnsiTheme="majorHAnsi" w:cstheme="majorHAnsi"/>
+                <w:sz w:val="24"/>
+                <w:szCs w:val="24"/>
+              </w:rPr>
+            </w:pPr>
+            <w:r>
+              <w:rPr>
+                <w:rFonts w:asciiTheme="majorHAnsi" w:hAnsiTheme="majorHAnsi" w:cstheme="majorHAnsi"/>
+                <w:sz w:val="24"/>
+                <w:szCs w:val="24"/>
+              </w:rPr>
+              <w:t>140</w:t>
+            </w:r>
+          </w:p>
+        </w:tc>
+        <w:tc>
+          <w:tcPr>
+            <w:tcW w:w="3969" w:type="dxa"/>
+            <w:tcMar>
+              <w:top w:w="110" w:type="dxa"/>
+              <w:left w:w="110" w:type="dxa"/>
+              <w:bottom w:w="110" w:type="dxa"/>
+              <w:right w:w="110" w:type="dxa"/>
+            </w:tcMar>
+            <w:vAlign w:val="center"/>
+          </w:tcPr>
+          <w:p>
+            <w:pPr>
+              <w:rPr>
+                <w:rFonts w:asciiTheme="majorHAnsi" w:hAnsiTheme="majorHAnsi" w:cstheme="majorHAnsi"/>
+                <w:sz w:val="24"/>
+                <w:szCs w:val="24"/>
+              </w:rPr>
+            </w:pPr>
+            <w:r>
+              <w:rPr>
+                <w:rFonts w:asciiTheme="majorHAnsi" w:hAnsiTheme="majorHAnsi" w:cstheme="majorHAnsi"/>
+                <w:sz w:val="24"/>
+                <w:szCs w:val="24"/>
+              </w:rPr>
+              <w:t>La carga objetivo alcanzó un nivel alto y sostenido.</w:t>
+            </w:r>
+          </w:p>
+        </w:tc>
+      </w:tr>
+      <w:tr>
+        <w:trPr>
+          <w:jc w:val="center"/>
+        </w:trPr>
+        <w:tc>
+          <w:tcPr>
+            <w:tcW w:w="2381" w:type="dxa"/>
+            <w:tcMar>
+              <w:top w:w="110" w:type="dxa"/>
+              <w:left w:w="110" w:type="dxa"/>
+              <w:bottom w:w="110" w:type="dxa"/>
+              <w:right w:w="110" w:type="dxa"/>
+            </w:tcMar>
+            <w:vAlign w:val="center"/>
+          </w:tcPr>
+          <w:p>
+            <w:pPr>
+              <w:rPr>
+                <w:rFonts w:asciiTheme="majorHAnsi" w:hAnsiTheme="majorHAnsi" w:cstheme="majorHAnsi"/>
+                <w:sz w:val="24"/>
+                <w:szCs w:val="24"/>
+              </w:rPr>
+            </w:pPr>
+            <w:proofErr w:type="spellStart"/>
+            <w:r>
+              <w:rPr>
+                <w:rFonts w:asciiTheme="majorHAnsi" w:hAnsiTheme="majorHAnsi" w:cstheme="majorHAnsi"/>
+                <w:sz w:val="24"/>
+                <w:szCs w:val="24"/>
+              </w:rPr>
+              <w:t>http_req_duration</w:t>
+            </w:r>
+            <w:proofErr w:type="spellEnd"/>
+          </w:p>
+        </w:tc>
+        <w:tc>
+          <w:tcPr>
+            <w:tcW w:w="2721" w:type="dxa"/>
+            <w:tcMar>
+              <w:top w:w="110" w:type="dxa"/>
+              <w:left w:w="110" w:type="dxa"/>
+              <w:bottom w:w="110" w:type="dxa"/>
+              <w:right w:w="110" w:type="dxa"/>
+            </w:tcMar>
+            <w:vAlign w:val="center"/>
+          </w:tcPr>
+          <w:p>
+            <w:pPr>
+              <w:rPr>
+                <w:rFonts w:asciiTheme="majorHAnsi" w:hAnsiTheme="majorHAnsi" w:cstheme="majorHAnsi"/>
+                <w:sz w:val="24"/>
+                <w:szCs w:val="24"/>
+              </w:rPr>
+            </w:pPr>
+            <w:r>
+              <w:rPr>
+                <w:rFonts w:asciiTheme="majorHAnsi" w:hAnsiTheme="majorHAnsi" w:cstheme="majorHAnsi"/>
+                <w:sz w:val="24"/>
+                <w:szCs w:val="24"/>
+              </w:rPr>
+              <w:t>avg 861.68 ms | p90 1.28 s | p95 1.57 s</w:t>
+            </w:r>
+          </w:p>
+        </w:tc>
+        <w:tc>
+          <w:tcPr>
+            <w:tcW w:w="3969" w:type="dxa"/>
+            <w:tcMar>
+              <w:top w:w="110" w:type="dxa"/>
+              <w:left w:w="110" w:type="dxa"/>
+              <w:bottom w:w="110" w:type="dxa"/>
+              <w:right w:w="110" w:type="dxa"/>
+            </w:tcMar>
+            <w:vAlign w:val="center"/>
+          </w:tcPr>
+          <w:p>
+            <w:pPr>
+              <w:rPr>
+                <w:rFonts w:asciiTheme="majorHAnsi" w:hAnsiTheme="majorHAnsi" w:cstheme="majorHAnsi"/>
+                <w:sz w:val="24"/>
+                <w:szCs w:val="24"/>
+              </w:rPr>
+            </w:pPr>
+            <w:r>
+              <w:rPr>
+                <w:rFonts w:asciiTheme="majorHAnsi" w:hAnsiTheme="majorHAnsi" w:cstheme="majorHAnsi"/>
+                <w:sz w:val="24"/>
+                <w:szCs w:val="24"/>
+              </w:rPr>
+              <w:t>La latencia muestra dispersión y presencia de cola en momentos puntuales.</w:t>
+            </w:r>
+          </w:p>
+        </w:tc>
+      </w:tr>
+      <w:tr>
+        <w:trPr>
+          <w:jc w:val="center"/>
+        </w:trPr>
+        <w:tc>
+          <w:tcPr>
+            <w:tcW w:w="2381" w:type="dxa"/>
+            <w:tcMar>
+              <w:top w:w="110" w:type="dxa"/>
+              <w:left w:w="110" w:type="dxa"/>
+              <w:bottom w:w="110" w:type="dxa"/>
+              <w:right w:w="110" w:type="dxa"/>
+            </w:tcMar>
+            <w:vAlign w:val="center"/>
+          </w:tcPr>
+          <w:p>
+            <w:pPr>
+              <w:rPr>
+                <w:rFonts w:asciiTheme="majorHAnsi" w:hAnsiTheme="majorHAnsi" w:cstheme="majorHAnsi"/>
+                <w:sz w:val="24"/>
+                <w:szCs w:val="24"/>
+              </w:rPr>
+            </w:pPr>
+            <w:proofErr w:type="spellStart"/>
+            <w:r>
+              <w:rPr>
+                <w:rFonts w:asciiTheme="majorHAnsi" w:hAnsiTheme="majorHAnsi" w:cstheme="majorHAnsi"/>
+                <w:sz w:val="24"/>
+                <w:szCs w:val="24"/>
+              </w:rPr>
+              <w:t>iteration_duration</w:t>
+            </w:r>
+            <w:proofErr w:type="spellEnd"/>
+          </w:p>
+        </w:tc>
+        <w:tc>
+          <w:tcPr>
+            <w:tcW w:w="2721" w:type="dxa"/>
+            <w:tcMar>
+              <w:top w:w="110" w:type="dxa"/>
+              <w:left w:w="110" w:type="dxa"/>
+              <w:bottom w:w="110" w:type="dxa"/>
+              <w:right w:w="110" w:type="dxa"/>
+            </w:tcMar>
+            <w:vAlign w:val="center"/>
+          </w:tcPr>
+          <w:p>
+            <w:pPr>
+              <w:rPr>
+                <w:rFonts w:asciiTheme="majorHAnsi" w:hAnsiTheme="majorHAnsi" w:cstheme="majorHAnsi"/>
+                <w:sz w:val="24"/>
+                <w:szCs w:val="24"/>
+              </w:rPr>
+            </w:pPr>
+            <w:r>
+              <w:rPr>
+                <w:rFonts w:asciiTheme="majorHAnsi" w:hAnsiTheme="majorHAnsi" w:cstheme="majorHAnsi"/>
+                <w:sz w:val="24"/>
+                <w:szCs w:val="24"/>
+              </w:rPr>
+              <w:t>avg 1.86 s | p90 2.29 s | p95 2.57 s</w:t>
+            </w:r>
+          </w:p>
+        </w:tc>
+        <w:tc>
+          <w:tcPr>
+            <w:tcW w:w="3969" w:type="dxa"/>
+            <w:tcMar>
+              <w:top w:w="110" w:type="dxa"/>
+              <w:left w:w="110" w:type="dxa"/>
+              <w:bottom w:w="110" w:type="dxa"/>
+              <w:right w:w="110" w:type="dxa"/>
+            </w:tcMar>
+            <w:vAlign w:val="center"/>
+          </w:tcPr>
+          <w:p>
+            <w:pPr>
+              <w:rPr>
+                <w:rFonts w:asciiTheme="majorHAnsi" w:hAnsiTheme="majorHAnsi" w:cstheme="majorHAnsi"/>
+                <w:sz w:val="24"/>
+                <w:szCs w:val="24"/>
+              </w:rPr>
+            </w:pPr>
+            <w:r>
+              <w:rPr>
+                <w:rFonts w:asciiTheme="majorHAnsi" w:hAnsiTheme="majorHAnsi" w:cstheme="majorHAnsi"/>
+                <w:sz w:val="24"/>
+                <w:szCs w:val="24"/>
+              </w:rPr>
+              <w:t>La iteración completa tarda más que la sola petición HTTP, como es esperado.</w:t>
+            </w:r>
+          </w:p>
+        </w:tc>
+      </w:tr>
+    </w:tbl>
+    <w:p>
+      <w:pPr>
+        <w:rPr>
+          <w:rFonts w:asciiTheme="majorHAnsi" w:hAnsiTheme="majorHAnsi" w:cstheme="majorHAnsi"/>
+          <w:sz w:val="24"/>
+          <w:szCs w:val="24"/>
         </w:rPr>
       </w:pPr>
     </w:p>
     <w:p>
       <w:pPr>
+        <w:pStyle w:val="Ttulo1"/>
+        <w:rPr>
+          <w:rFonts w:cstheme="majorHAnsi"/>
+          <w:color w:val="auto"/>
+          <w:sz w:val="24"/>
+          <w:szCs w:val="24"/>
+        </w:rPr>
+      </w:pPr>
+      <w:r>
+        <w:rPr>
+          <w:rFonts w:cstheme="majorHAnsi"/>
+          <w:color w:val="auto"/>
+          <w:sz w:val="24"/>
+          <w:szCs w:val="24"/>
+        </w:rPr>
+        <w:t>3. Hallazgos principales</w:t>
+      </w:r>
+    </w:p>
+    <w:p>
+      <w:pPr>
+        <w:pStyle w:val="Ttulo2"/>
+        <w:rPr>
+          <w:rFonts w:cstheme="majorHAnsi"/>
+          <w:color w:val="auto"/>
+          <w:sz w:val="24"/>
+          <w:szCs w:val="24"/>
+        </w:rPr>
+      </w:pPr>
+      <w:r>
+        <w:rPr>
+          <w:rFonts w:cstheme="majorHAnsi"/>
+          <w:color w:val="auto"/>
+          <w:sz w:val="24"/>
+          <w:szCs w:val="24"/>
+        </w:rPr>
+        <w:t>3.1 Comportamiento general de la carga</w:t>
+      </w:r>
+    </w:p>
+    <w:p>
+      <w:pPr>
+        <w:pStyle w:val="Listaconvietas"/>
         <w:rPr>
           <w:rFonts w:asciiTheme="majorHAnsi" w:hAnsiTheme="majorHAnsi" w:cstheme="majorHAnsi"/>
+          <w:sz w:val="24"/>
+          <w:szCs w:val="24"/>
         </w:rPr>
       </w:pPr>
       <w:r>
         <w:rPr>
           <w:rFonts w:asciiTheme="majorHAnsi" w:hAnsiTheme="majorHAnsi" w:cstheme="majorHAnsi"/>
+          <w:sz w:val="24"/>
+          <w:szCs w:val="24"/>
         </w:rPr>
-        <w:t>Informe de Resultados – Prueba de Carga</w:t>
+        <w:t>La prueba operó con una carga alta de hasta 140 usuarios virtuales y un throughput cercano a 73 solicitudes por segundo en el resumen general.</w:t>
+      </w:r>
+    </w:p>
+    <w:p>
+      <w:pPr>
+        <w:pStyle w:val="Listaconvietas"/>
+        <w:rPr>
+          <w:rFonts w:asciiTheme="majorHAnsi" w:hAnsiTheme="majorHAnsi" w:cstheme="majorHAnsi"/>
+          <w:sz w:val="24"/>
+          <w:szCs w:val="24"/>
+        </w:rPr>
+      </w:pPr>
+      <w:r>
+        <w:rPr>
+          <w:rFonts w:asciiTheme="majorHAnsi" w:hAnsiTheme="majorHAnsi" w:cstheme="majorHAnsi"/>
+          <w:sz w:val="24"/>
+          <w:szCs w:val="24"/>
+        </w:rPr>
+        <w:t>En el gráfico se observa una caída marcada en la tasa de peticiones y en el nivel efectivo de actividad entre 01:50 y 02:00 aproximadamente.</w:t>
+      </w:r>
+    </w:p>
+    <w:p>
+      <w:pPr>
+        <w:pStyle w:val="Listaconvietas"/>
+        <w:rPr>
+          <w:rFonts w:asciiTheme="majorHAnsi" w:hAnsiTheme="majorHAnsi" w:cstheme="majorHAnsi"/>
+          <w:sz w:val="24"/>
+          <w:szCs w:val="24"/>
+        </w:rPr>
+      </w:pPr>
+      <w:r>
+        <w:rPr>
+          <w:rFonts w:asciiTheme="majorHAnsi" w:hAnsiTheme="majorHAnsi" w:cstheme="majorHAnsi"/>
+          <w:sz w:val="24"/>
+          <w:szCs w:val="24"/>
+        </w:rPr>
+        <w:t>Después de ese intervalo, el sistema recupera el comportamiento y vuelve a un rango estable de operación hasta el final de la prueba.</w:t>
+      </w:r>
+    </w:p>
+    <w:p>
+      <w:pPr>
+        <w:pStyle w:val="Ttulo2"/>
+        <w:rPr>
+          <w:rFonts w:cstheme="majorHAnsi"/>
+          <w:color w:val="auto"/>
+          <w:sz w:val="24"/>
+          <w:szCs w:val="24"/>
+        </w:rPr>
+      </w:pPr>
+      <w:r>
+        <w:rPr>
+          <w:rFonts w:cstheme="majorHAnsi"/>
+          <w:color w:val="auto"/>
+          <w:sz w:val="24"/>
+          <w:szCs w:val="24"/>
+        </w:rPr>
+        <w:lastRenderedPageBreak/>
+        <w:t>3.2 Tiempos de respuesta</w:t>
+      </w:r>
+    </w:p>
+    <w:p>
+      <w:pPr>
+        <w:pStyle w:val="Listaconvietas"/>
+        <w:rPr>
+          <w:rFonts w:asciiTheme="majorHAnsi" w:hAnsiTheme="majorHAnsi" w:cstheme="majorHAnsi"/>
+          <w:sz w:val="24"/>
+          <w:szCs w:val="24"/>
+        </w:rPr>
+      </w:pPr>
+      <w:r>
+        <w:rPr>
+          <w:rFonts w:asciiTheme="majorHAnsi" w:hAnsiTheme="majorHAnsi" w:cstheme="majorHAnsi"/>
+          <w:sz w:val="24"/>
+          <w:szCs w:val="24"/>
+        </w:rPr>
+        <w:t>El resumen visible reporta http_req_duration con avg de 861.68 ms, mediana de 613.42 ms, p90 de 1.28 s y p95 de 1.57 s.</w:t>
+      </w:r>
+    </w:p>
+    <w:p>
+      <w:pPr>
+        <w:pStyle w:val="Listaconvietas"/>
+        <w:rPr>
+          <w:rFonts w:asciiTheme="majorHAnsi" w:hAnsiTheme="majorHAnsi" w:cstheme="majorHAnsi"/>
+          <w:sz w:val="24"/>
+          <w:szCs w:val="24"/>
+        </w:rPr>
+      </w:pPr>
+      <w:r>
+        <w:rPr>
+          <w:rFonts w:asciiTheme="majorHAnsi" w:hAnsiTheme="majorHAnsi" w:cstheme="majorHAnsi"/>
+          <w:sz w:val="24"/>
+          <w:szCs w:val="24"/>
+        </w:rPr>
+        <w:t>La diferencia entre la mediana y los percentiles indica una distribución no uniforme, con una cola de respuestas más lentas en parte de la ejecución.</w:t>
+      </w:r>
+    </w:p>
+    <w:p>
+      <w:pPr>
+        <w:pStyle w:val="Listaconvietas"/>
+        <w:rPr>
+          <w:rFonts w:asciiTheme="majorHAnsi" w:hAnsiTheme="majorHAnsi" w:cstheme="majorHAnsi"/>
+          <w:sz w:val="24"/>
+          <w:szCs w:val="24"/>
+        </w:rPr>
+      </w:pPr>
+      <w:r>
+        <w:rPr>
+          <w:rFonts w:asciiTheme="majorHAnsi" w:hAnsiTheme="majorHAnsi" w:cstheme="majorHAnsi"/>
+          <w:sz w:val="24"/>
+          <w:szCs w:val="24"/>
+        </w:rPr>
+        <w:t>El tiempo de iteration_duration promedio de 1.86 s confirma que la duración total del flujo es mayor que el tiempo exclusivo de la petición HTTP.</w:t>
+      </w:r>
+    </w:p>
+    <w:p>
+      <w:pPr>
+        <w:pStyle w:val="Ttulo2"/>
+        <w:rPr>
+          <w:rFonts w:cstheme="majorHAnsi"/>
+          <w:color w:val="auto"/>
+          <w:sz w:val="24"/>
+          <w:szCs w:val="24"/>
+        </w:rPr>
+      </w:pPr>
+      <w:r>
+        <w:rPr>
+          <w:rFonts w:cstheme="majorHAnsi"/>
+          <w:color w:val="auto"/>
+          <w:sz w:val="24"/>
+          <w:szCs w:val="24"/>
+        </w:rPr>
+        <w:t>3.3 Errores observados</w:t>
+      </w:r>
+    </w:p>
+    <w:p>
+      <w:pPr>
+        <w:pStyle w:val="Listaconvietas"/>
+        <w:rPr>
+          <w:rFonts w:asciiTheme="majorHAnsi" w:hAnsiTheme="majorHAnsi" w:cstheme="majorHAnsi"/>
+          <w:sz w:val="24"/>
+          <w:szCs w:val="24"/>
+        </w:rPr>
+      </w:pPr>
+      <w:r>
+        <w:rPr>
+          <w:rFonts w:asciiTheme="majorHAnsi" w:hAnsiTheme="majorHAnsi" w:cstheme="majorHAnsi"/>
+          <w:sz w:val="24"/>
+          <w:szCs w:val="24"/>
+        </w:rPr>
+        <w:t>Se evidencian aproximadamente 6,759 requests fallidos, equivalentes a una tasa de error de 2.44%.</w:t>
+      </w:r>
+    </w:p>
+    <w:p>
+      <w:pPr>
+        <w:pStyle w:val="Listaconvietas"/>
+        <w:rPr>
+          <w:rFonts w:asciiTheme="majorHAnsi" w:hAnsiTheme="majorHAnsi" w:cstheme="majorHAnsi"/>
+          <w:sz w:val="24"/>
+          <w:szCs w:val="24"/>
+        </w:rPr>
+      </w:pPr>
+      <w:r>
+        <w:rPr>
+          <w:rFonts w:asciiTheme="majorHAnsi" w:hAnsiTheme="majorHAnsi" w:cstheme="majorHAnsi"/>
+          <w:sz w:val="24"/>
+          <w:szCs w:val="24"/>
+        </w:rPr>
+        <w:t xml:space="preserve">La distribución por etapas sugiere que la mayor concentración de fallos ocurrió en una fase intermedia de la prueba, </w:t>
+      </w:r>
+      <w:proofErr w:type="gramStart"/>
+      <w:r>
+        <w:rPr>
+          <w:rFonts w:asciiTheme="majorHAnsi" w:hAnsiTheme="majorHAnsi" w:cstheme="majorHAnsi"/>
+          <w:sz w:val="24"/>
+          <w:szCs w:val="24"/>
+        </w:rPr>
+        <w:t>no</w:t>
+      </w:r>
+      <w:proofErr w:type="gramEnd"/>
+      <w:r>
+        <w:rPr>
+          <w:rFonts w:asciiTheme="majorHAnsi" w:hAnsiTheme="majorHAnsi" w:cstheme="majorHAnsi"/>
+          <w:sz w:val="24"/>
+          <w:szCs w:val="24"/>
+        </w:rPr>
+        <w:t xml:space="preserve"> al cierre.</w:t>
+      </w:r>
+    </w:p>
+    <w:p>
+      <w:pPr>
+        <w:pStyle w:val="Listaconvietas"/>
+        <w:rPr>
+          <w:rFonts w:asciiTheme="majorHAnsi" w:hAnsiTheme="majorHAnsi" w:cstheme="majorHAnsi"/>
+          <w:sz w:val="24"/>
+          <w:szCs w:val="24"/>
+        </w:rPr>
+      </w:pPr>
+      <w:r>
+        <w:rPr>
+          <w:rFonts w:asciiTheme="majorHAnsi" w:hAnsiTheme="majorHAnsi" w:cstheme="majorHAnsi"/>
+          <w:sz w:val="24"/>
+          <w:szCs w:val="24"/>
+        </w:rPr>
+        <w:t>Aunque la tasa de éxito global supera el 97%, el volumen absoluto de errores no debe considerarse menor y amerita análisis técnico.</w:t>
+      </w:r>
+    </w:p>
+    <w:p>
+      <w:pPr>
+        <w:pStyle w:val="Ttulo2"/>
+        <w:rPr>
+          <w:rFonts w:cstheme="majorHAnsi"/>
+          <w:color w:val="auto"/>
+          <w:sz w:val="24"/>
+          <w:szCs w:val="24"/>
+        </w:rPr>
+      </w:pPr>
+      <w:r>
+        <w:rPr>
+          <w:rFonts w:cstheme="majorHAnsi"/>
+          <w:color w:val="auto"/>
+          <w:sz w:val="24"/>
+          <w:szCs w:val="24"/>
+        </w:rPr>
+        <w:t>3.4 Relación entre VUs y peticiones por segundo</w:t>
+      </w:r>
+    </w:p>
+    <w:p>
+      <w:pPr>
+        <w:pStyle w:val="Listaconvietas"/>
+        <w:rPr>
+          <w:rFonts w:asciiTheme="majorHAnsi" w:hAnsiTheme="majorHAnsi" w:cstheme="majorHAnsi"/>
+          <w:sz w:val="24"/>
+          <w:szCs w:val="24"/>
+        </w:rPr>
+      </w:pPr>
+      <w:r>
+        <w:rPr>
+          <w:rFonts w:asciiTheme="majorHAnsi" w:hAnsiTheme="majorHAnsi" w:cstheme="majorHAnsi"/>
+          <w:sz w:val="24"/>
+          <w:szCs w:val="24"/>
+        </w:rPr>
+        <w:t xml:space="preserve">El gráfico muestra que cuando la prueba se estabiliza, 140 VUs sostienen alrededor de 80 </w:t>
+      </w:r>
+      <w:proofErr w:type="gramStart"/>
+      <w:r>
+        <w:rPr>
+          <w:rFonts w:asciiTheme="majorHAnsi" w:hAnsiTheme="majorHAnsi" w:cstheme="majorHAnsi"/>
+          <w:sz w:val="24"/>
+          <w:szCs w:val="24"/>
+        </w:rPr>
+        <w:t>a</w:t>
+      </w:r>
+      <w:proofErr w:type="gramEnd"/>
+      <w:r>
+        <w:rPr>
+          <w:rFonts w:asciiTheme="majorHAnsi" w:hAnsiTheme="majorHAnsi" w:cstheme="majorHAnsi"/>
+          <w:sz w:val="24"/>
+          <w:szCs w:val="24"/>
+        </w:rPr>
+        <w:t xml:space="preserve"> 85 req/s; por ejemplo, a las 02:02 se observan 140 VUs y 82.6 req/s.</w:t>
+      </w:r>
+    </w:p>
+    <w:p>
+      <w:pPr>
+        <w:pStyle w:val="Listaconvietas"/>
+        <w:rPr>
+          <w:rFonts w:asciiTheme="majorHAnsi" w:hAnsiTheme="majorHAnsi" w:cstheme="majorHAnsi"/>
+          <w:sz w:val="24"/>
+          <w:szCs w:val="24"/>
+        </w:rPr>
+      </w:pPr>
+      <w:r>
+        <w:rPr>
+          <w:rFonts w:asciiTheme="majorHAnsi" w:hAnsiTheme="majorHAnsi" w:cstheme="majorHAnsi"/>
+          <w:sz w:val="24"/>
+          <w:szCs w:val="24"/>
+        </w:rPr>
+        <w:t>La caída temporal no permanece hasta el final: la curva se recupera y mantiene un patrón relativamente estable después del incidente.</w:t>
+      </w:r>
+    </w:p>
+    <w:p>
+      <w:pPr>
+        <w:pStyle w:val="Listaconvietas"/>
+        <w:rPr>
+          <w:rFonts w:asciiTheme="majorHAnsi" w:hAnsiTheme="majorHAnsi" w:cstheme="majorHAnsi"/>
+          <w:sz w:val="24"/>
+          <w:szCs w:val="24"/>
+        </w:rPr>
+      </w:pPr>
+      <w:r>
+        <w:rPr>
+          <w:rFonts w:asciiTheme="majorHAnsi" w:hAnsiTheme="majorHAnsi" w:cstheme="majorHAnsi"/>
+          <w:sz w:val="24"/>
+          <w:szCs w:val="24"/>
+        </w:rPr>
+        <w:t>Por lo anterior, el comportamiento es más consistente con una degradación transitoria y recuperación posterior que con una saturación continua del sistema.</w:t>
+      </w:r>
+    </w:p>
+    <w:p>
+      <w:pPr>
+        <w:pStyle w:val="Ttulo1"/>
+        <w:rPr>
+          <w:rFonts w:cstheme="majorHAnsi"/>
+          <w:color w:val="auto"/>
+          <w:sz w:val="24"/>
+          <w:szCs w:val="24"/>
+        </w:rPr>
+      </w:pPr>
+      <w:r>
+        <w:rPr>
+          <w:rFonts w:cstheme="majorHAnsi"/>
+          <w:color w:val="auto"/>
+          <w:sz w:val="24"/>
+          <w:szCs w:val="24"/>
+        </w:rPr>
+        <w:t>4. Ajustes de interpretación solicitados</w:t>
       </w:r>
     </w:p>
     <w:p>
       <w:pPr>
         <w:rPr>
           <w:rFonts w:asciiTheme="majorHAnsi" w:hAnsiTheme="majorHAnsi" w:cstheme="majorHAnsi"/>
-        </w:rPr>
-      </w:pPr>
-    </w:p>
-    <w:p>
-      <w:pPr>
-        <w:rPr>
-          <w:rFonts w:asciiTheme="majorHAnsi" w:hAnsiTheme="majorHAnsi" w:cstheme="majorHAnsi"/>
+          <w:sz w:val="24"/>
+          <w:szCs w:val="24"/>
         </w:rPr>
       </w:pPr>
       <w:r>
         <w:rPr>
           <w:rFonts w:asciiTheme="majorHAnsi" w:hAnsiTheme="majorHAnsi" w:cstheme="majorHAnsi"/>
+          <w:sz w:val="24"/>
+          <w:szCs w:val="24"/>
         </w:rPr>
-        <w:t>1. Introducción</w:t>
+        <w:t>Con base en las observaciones suministradas para el ejercicio, se deben corregir varias lecturas que pueden llevar a conclusiones equivocadas:</w:t>
+      </w:r>
+    </w:p>
+    <w:p>
+      <w:pPr>
+        <w:pStyle w:val="Listaconvietas"/>
+        <w:rPr>
+          <w:rFonts w:asciiTheme="majorHAnsi" w:hAnsiTheme="majorHAnsi" w:cstheme="majorHAnsi"/>
+          <w:sz w:val="24"/>
+          <w:szCs w:val="24"/>
+        </w:rPr>
+      </w:pPr>
+      <w:r>
+        <w:rPr>
+          <w:rFonts w:asciiTheme="majorHAnsi" w:hAnsiTheme="majorHAnsi" w:cstheme="majorHAnsi"/>
+          <w:sz w:val="24"/>
+          <w:szCs w:val="24"/>
+        </w:rPr>
+        <w:t xml:space="preserve">El dato de 861.68 ms no debe asumirse automáticamente como el tiempo promedio real del negocio sin validar primero si corresponde a http_req_duration o </w:t>
+      </w:r>
+      <w:proofErr w:type="gramStart"/>
+      <w:r>
+        <w:rPr>
+          <w:rFonts w:asciiTheme="majorHAnsi" w:hAnsiTheme="majorHAnsi" w:cstheme="majorHAnsi"/>
+          <w:sz w:val="24"/>
+          <w:szCs w:val="24"/>
+        </w:rPr>
+        <w:t>a</w:t>
+      </w:r>
+      <w:proofErr w:type="gramEnd"/>
+      <w:r>
+        <w:rPr>
+          <w:rFonts w:asciiTheme="majorHAnsi" w:hAnsiTheme="majorHAnsi" w:cstheme="majorHAnsi"/>
+          <w:sz w:val="24"/>
+          <w:szCs w:val="24"/>
+        </w:rPr>
+        <w:t xml:space="preserve"> otra métrica usada en el ejercicio.</w:t>
+      </w:r>
+    </w:p>
+    <w:p>
+      <w:pPr>
+        <w:pStyle w:val="Listaconvietas"/>
+        <w:rPr>
+          <w:rFonts w:asciiTheme="majorHAnsi" w:hAnsiTheme="majorHAnsi" w:cstheme="majorHAnsi"/>
+          <w:sz w:val="24"/>
+          <w:szCs w:val="24"/>
+        </w:rPr>
+      </w:pPr>
+      <w:r>
+        <w:rPr>
+          <w:rFonts w:asciiTheme="majorHAnsi" w:hAnsiTheme="majorHAnsi" w:cstheme="majorHAnsi"/>
+          <w:sz w:val="24"/>
+          <w:szCs w:val="24"/>
+        </w:rPr>
+        <w:t>El valor de 191 ms requiere verificación directa contra la fuente original, ya que en la captura visible aparece como mínimo de http_req_duration y no como promedio.</w:t>
+      </w:r>
+    </w:p>
+    <w:p>
+      <w:pPr>
+        <w:pStyle w:val="Listaconvietas"/>
+        <w:rPr>
+          <w:rFonts w:asciiTheme="majorHAnsi" w:hAnsiTheme="majorHAnsi" w:cstheme="majorHAnsi"/>
+          <w:sz w:val="24"/>
+          <w:szCs w:val="24"/>
+        </w:rPr>
+      </w:pPr>
+      <w:r>
+        <w:rPr>
+          <w:rFonts w:asciiTheme="majorHAnsi" w:hAnsiTheme="majorHAnsi" w:cstheme="majorHAnsi"/>
+          <w:sz w:val="24"/>
+          <w:szCs w:val="24"/>
+        </w:rPr>
+        <w:t>La lectura de percentiles debe revisarse cuidadosamente. Una confusión entre p90 y p95 cambia la evaluación del umbral aceptable y puede inducir una conclusión incorrecta de optimización obligatoria.</w:t>
+      </w:r>
+    </w:p>
+    <w:p>
+      <w:pPr>
+        <w:pStyle w:val="Listaconvietas"/>
+        <w:rPr>
+          <w:rFonts w:asciiTheme="majorHAnsi" w:hAnsiTheme="majorHAnsi" w:cstheme="majorHAnsi"/>
+          <w:sz w:val="24"/>
+          <w:szCs w:val="24"/>
+        </w:rPr>
+      </w:pPr>
+      <w:r>
+        <w:rPr>
+          <w:rFonts w:asciiTheme="majorHAnsi" w:hAnsiTheme="majorHAnsi" w:cstheme="majorHAnsi"/>
+          <w:sz w:val="24"/>
+          <w:szCs w:val="24"/>
+        </w:rPr>
+        <w:t>La interpretación del gráfico debe incorporar explícitamente la ventana de caída entre 01:50 y 02:00 y el hecho de que luego existe recuperación y estabilidad.</w:t>
+      </w:r>
+    </w:p>
+    <w:p>
+      <w:pPr>
+        <w:pStyle w:val="Ttulo1"/>
+        <w:rPr>
+          <w:rFonts w:cstheme="majorHAnsi"/>
+          <w:color w:val="auto"/>
+          <w:sz w:val="24"/>
+          <w:szCs w:val="24"/>
+        </w:rPr>
+      </w:pPr>
+      <w:r>
+        <w:rPr>
+          <w:rFonts w:cstheme="majorHAnsi"/>
+          <w:color w:val="auto"/>
+          <w:sz w:val="24"/>
+          <w:szCs w:val="24"/>
+        </w:rPr>
+        <w:lastRenderedPageBreak/>
+        <w:t>5. Conclusiones</w:t>
+      </w:r>
+    </w:p>
+    <w:p>
+      <w:pPr>
+        <w:pStyle w:val="Listaconvietas"/>
+        <w:rPr>
+          <w:rFonts w:asciiTheme="majorHAnsi" w:hAnsiTheme="majorHAnsi" w:cstheme="majorHAnsi"/>
+          <w:sz w:val="24"/>
+          <w:szCs w:val="24"/>
+        </w:rPr>
+      </w:pPr>
+      <w:r>
+        <w:rPr>
+          <w:rFonts w:asciiTheme="majorHAnsi" w:hAnsiTheme="majorHAnsi" w:cstheme="majorHAnsi"/>
+          <w:sz w:val="24"/>
+          <w:szCs w:val="24"/>
+        </w:rPr>
+        <w:t>La prueba no evidencia un colapso sostenido del sistema. Se observa un evento de degradación temporal, pero con recuperación posterior y continuidad operativa.</w:t>
+      </w:r>
+    </w:p>
+    <w:p>
+      <w:pPr>
+        <w:pStyle w:val="Listaconvietas"/>
+        <w:rPr>
+          <w:rFonts w:asciiTheme="majorHAnsi" w:hAnsiTheme="majorHAnsi" w:cstheme="majorHAnsi"/>
+          <w:sz w:val="24"/>
+          <w:szCs w:val="24"/>
+        </w:rPr>
+      </w:pPr>
+      <w:r>
+        <w:rPr>
+          <w:rFonts w:asciiTheme="majorHAnsi" w:hAnsiTheme="majorHAnsi" w:cstheme="majorHAnsi"/>
+          <w:sz w:val="24"/>
+          <w:szCs w:val="24"/>
+        </w:rPr>
+        <w:t>El sistema soportó una carga alta con 140 VUs y mantuvo una tasa estable de peticiones por segundo durante la mayor parte de la ejecución.</w:t>
+      </w:r>
+    </w:p>
+    <w:p>
+      <w:pPr>
+        <w:pStyle w:val="Listaconvietas"/>
+        <w:rPr>
+          <w:rFonts w:asciiTheme="majorHAnsi" w:hAnsiTheme="majorHAnsi" w:cstheme="majorHAnsi"/>
+          <w:sz w:val="24"/>
+          <w:szCs w:val="24"/>
+        </w:rPr>
+      </w:pPr>
+      <w:r>
+        <w:rPr>
+          <w:rFonts w:asciiTheme="majorHAnsi" w:hAnsiTheme="majorHAnsi" w:cstheme="majorHAnsi"/>
+          <w:sz w:val="24"/>
+          <w:szCs w:val="24"/>
+        </w:rPr>
+        <w:t>La tasa de error de 2.44% y el volumen aproximado de 6,759 fallos indican que aún existen condiciones que deben analizarse, aunque no invalidan por completo el comportamiento general de estabilidad.</w:t>
+      </w:r>
+    </w:p>
+    <w:p>
+      <w:pPr>
+        <w:pStyle w:val="Listaconvietas"/>
+        <w:rPr>
+          <w:rFonts w:asciiTheme="majorHAnsi" w:hAnsiTheme="majorHAnsi" w:cstheme="majorHAnsi"/>
+          <w:sz w:val="24"/>
+          <w:szCs w:val="24"/>
+        </w:rPr>
+      </w:pPr>
+      <w:r>
+        <w:rPr>
+          <w:rFonts w:asciiTheme="majorHAnsi" w:hAnsiTheme="majorHAnsi" w:cstheme="majorHAnsi"/>
+          <w:sz w:val="24"/>
+          <w:szCs w:val="24"/>
+        </w:rPr>
+        <w:t>La conclusión final sobre cumplimiento de tiempos debe condicionarse a la validación de la métrica exacta utilizada como referencia, especialmente por la inconsistencia detectada entre 861.68 ms y 191 ms.</w:t>
+      </w:r>
+    </w:p>
+    <w:p>
+      <w:pPr>
+        <w:pStyle w:val="Ttulo1"/>
+        <w:rPr>
+          <w:rFonts w:cstheme="majorHAnsi"/>
+          <w:color w:val="auto"/>
+          <w:sz w:val="24"/>
+          <w:szCs w:val="24"/>
+        </w:rPr>
+      </w:pPr>
+      <w:r>
+        <w:rPr>
+          <w:rFonts w:cstheme="majorHAnsi"/>
+          <w:color w:val="auto"/>
+          <w:sz w:val="24"/>
+          <w:szCs w:val="24"/>
+        </w:rPr>
+        <w:t>6. Recomendaciones</w:t>
+      </w:r>
+    </w:p>
+    <w:p>
+      <w:pPr>
+        <w:pStyle w:val="Listaconvietas"/>
+        <w:rPr>
+          <w:rFonts w:asciiTheme="majorHAnsi" w:hAnsiTheme="majorHAnsi" w:cstheme="majorHAnsi"/>
+          <w:sz w:val="24"/>
+          <w:szCs w:val="24"/>
+        </w:rPr>
+      </w:pPr>
+      <w:r>
+        <w:rPr>
+          <w:rFonts w:asciiTheme="majorHAnsi" w:hAnsiTheme="majorHAnsi" w:cstheme="majorHAnsi"/>
+          <w:sz w:val="24"/>
+          <w:szCs w:val="24"/>
+        </w:rPr>
+        <w:t>Validar en la fuente original qué métrica debe usarse para el análisis oficial: http_req_duration, http_req_waiting o iteration_duration.</w:t>
+      </w:r>
+    </w:p>
+    <w:p>
+      <w:pPr>
+        <w:pStyle w:val="Listaconvietas"/>
+        <w:rPr>
+          <w:rFonts w:asciiTheme="majorHAnsi" w:hAnsiTheme="majorHAnsi" w:cstheme="majorHAnsi"/>
+          <w:sz w:val="24"/>
+          <w:szCs w:val="24"/>
+        </w:rPr>
+      </w:pPr>
+      <w:r>
+        <w:rPr>
+          <w:rFonts w:asciiTheme="majorHAnsi" w:hAnsiTheme="majorHAnsi" w:cstheme="majorHAnsi"/>
+          <w:sz w:val="24"/>
+          <w:szCs w:val="24"/>
+        </w:rPr>
+        <w:t>Correlacionar la caída observada entre 01:50 y 02:00 con logs de aplicación, métricas de infraestructura, pool de conexiones, tiempos de espera y eventos de red.</w:t>
+      </w:r>
+    </w:p>
+    <w:p>
+      <w:pPr>
+        <w:pStyle w:val="Listaconvietas"/>
+        <w:rPr>
+          <w:rFonts w:asciiTheme="majorHAnsi" w:hAnsiTheme="majorHAnsi" w:cstheme="majorHAnsi"/>
+          <w:sz w:val="24"/>
+          <w:szCs w:val="24"/>
+        </w:rPr>
+      </w:pPr>
+      <w:r>
+        <w:rPr>
+          <w:rFonts w:asciiTheme="majorHAnsi" w:hAnsiTheme="majorHAnsi" w:cstheme="majorHAnsi"/>
+          <w:sz w:val="24"/>
+          <w:szCs w:val="24"/>
+        </w:rPr>
+        <w:t>Revisar la clasificación exacta de los errores HTTP y su distribución por etapa para identificar si existe un patrón asociado al ramp-up, estabilización o transición de carga.</w:t>
+      </w:r>
+    </w:p>
+    <w:p>
+      <w:pPr>
+        <w:pStyle w:val="Listaconvietas"/>
+        <w:rPr>
+          <w:rFonts w:asciiTheme="majorHAnsi" w:hAnsiTheme="majorHAnsi" w:cstheme="majorHAnsi"/>
+          <w:sz w:val="24"/>
+          <w:szCs w:val="24"/>
+        </w:rPr>
+      </w:pPr>
+      <w:r>
+        <w:rPr>
+          <w:rFonts w:asciiTheme="majorHAnsi" w:hAnsiTheme="majorHAnsi" w:cstheme="majorHAnsi"/>
+          <w:sz w:val="24"/>
+          <w:szCs w:val="24"/>
+        </w:rPr>
+        <w:t>Repetir la prueba con monitoreo complementario del backend, base de datos y recursos del servidor para confirmar si la caída transitoria responde a un cuello de botella puntual.</w:t>
+      </w:r>
+    </w:p>
+    <w:p>
+      <w:pPr>
+        <w:pStyle w:val="Listaconvietas"/>
+        <w:rPr>
+          <w:rFonts w:asciiTheme="majorHAnsi" w:hAnsiTheme="majorHAnsi" w:cstheme="majorHAnsi"/>
+          <w:sz w:val="24"/>
+          <w:szCs w:val="24"/>
+        </w:rPr>
+      </w:pPr>
+      <w:r>
+        <w:rPr>
+          <w:rFonts w:asciiTheme="majorHAnsi" w:hAnsiTheme="majorHAnsi" w:cstheme="majorHAnsi"/>
+          <w:sz w:val="24"/>
+          <w:szCs w:val="24"/>
+        </w:rPr>
+        <w:t>Documentar explícitamente en el informe final que la prueba mostró recuperación; esto evita una interpretación errónea de saturación permanente.</w:t>
+      </w:r>
+    </w:p>
+    <w:p>
+      <w:pPr>
+        <w:pStyle w:val="Ttulo1"/>
+        <w:rPr>
+          <w:rFonts w:cstheme="majorHAnsi"/>
+          <w:color w:val="auto"/>
+          <w:sz w:val="24"/>
+          <w:szCs w:val="24"/>
+        </w:rPr>
+      </w:pPr>
+      <w:r>
+        <w:rPr>
+          <w:rFonts w:cstheme="majorHAnsi"/>
+          <w:color w:val="auto"/>
+          <w:sz w:val="24"/>
+          <w:szCs w:val="24"/>
+        </w:rPr>
+        <w:t>7. Cierre</w:t>
       </w:r>
     </w:p>
     <w:p>
       <w:pPr>
         <w:rPr>
           <w:rFonts w:asciiTheme="majorHAnsi" w:hAnsiTheme="majorHAnsi" w:cstheme="majorHAnsi"/>
+          <w:sz w:val="24"/>
+          <w:szCs w:val="24"/>
         </w:rPr>
       </w:pPr>
       <w:r>
         <w:rPr>
           <w:rFonts w:asciiTheme="majorHAnsi" w:hAnsiTheme="majorHAnsi" w:cstheme="majorHAnsi"/>
+          <w:sz w:val="24"/>
+          <w:szCs w:val="24"/>
         </w:rPr>
-        <w:t>El presente documento tiene como objetivo analizar los resultados obtenidos a partir de la ejecución de una prueba de carga, tomando como base el archivo textSummary.txt y el diagrama de monitoreo suministrado. El análisis busca identificar el comportamiento del sistema bajo carga, evaluar el cumplimiento de criterios de desempeño y proponer recomendaciones para su mejora.</w:t>
+        <w:t>En términos generales, la ejecución muestra un servicio que responde de forma aceptable durante la mayor parte del tiempo, pero que presenta un episodio puntual de degradación que debe investigarse. La lectura correcta de las métricas y del gráfico es clave para evitar conclusiones inconsistentes frente al comportamiento real de la prueba.</w:t>
       </w:r>
-    </w:p>
-    <w:p>
-      <w:pPr>
-        <w:rPr>
-          <w:rFonts w:asciiTheme="majorHAnsi" w:hAnsiTheme="majorHAnsi" w:cstheme="majorHAnsi"/>
-        </w:rPr>
-      </w:pPr>
-    </w:p>
-    <w:p>
-      <w:pPr>
-        <w:rPr>
-          <w:rFonts w:asciiTheme="majorHAnsi" w:hAnsiTheme="majorHAnsi" w:cstheme="majorHAnsi"/>
-        </w:rPr>
-      </w:pPr>
-      <w:r>
-        <w:rPr>
-          <w:rFonts w:asciiTheme="majorHAnsi" w:hAnsiTheme="majorHAnsi" w:cstheme="majorHAnsi"/>
-        </w:rPr>
-        <w:t>2. Objetivo</w:t>
-      </w:r>
-    </w:p>
-    <w:p>
-      <w:pPr>
-        <w:rPr>
-          <w:rFonts w:asciiTheme="majorHAnsi" w:hAnsiTheme="majorHAnsi" w:cstheme="majorHAnsi"/>
-        </w:rPr>
-      </w:pPr>
-      <w:r>
-        <w:rPr>
-          <w:rFonts w:asciiTheme="majorHAnsi" w:hAnsiTheme="majorHAnsi" w:cstheme="majorHAnsi"/>
-        </w:rPr>
-        <w:t>Evaluar el desempeño del servicio bajo condiciones de carga, analizando métricas como tiempo de respuesta, tasa de error y throughput (TPS), con el fin de determinar su estabilidad y capacidad operativa.</w:t>
-      </w:r>
-    </w:p>
-    <w:p>
-      <w:pPr>
-        <w:rPr>
-          <w:rFonts w:asciiTheme="majorHAnsi" w:hAnsiTheme="majorHAnsi" w:cstheme="majorHAnsi"/>
-        </w:rPr>
-      </w:pPr>
-    </w:p>
-    <w:p>
-      <w:pPr>
-        <w:rPr>
-          <w:rFonts w:asciiTheme="majorHAnsi" w:hAnsiTheme="majorHAnsi" w:cstheme="majorHAnsi"/>
-        </w:rPr>
-      </w:pPr>
-      <w:r>
-        <w:rPr>
-          <w:rFonts w:asciiTheme="majorHAnsi" w:hAnsiTheme="majorHAnsi" w:cstheme="majorHAnsi"/>
-        </w:rPr>
-        <w:t>3. Criterios de evaluación</w:t>
-      </w:r>
-    </w:p>
-    <w:p>
-      <w:pPr>
-        <w:rPr>
-          <w:rFonts w:asciiTheme="majorHAnsi" w:hAnsiTheme="majorHAnsi" w:cstheme="majorHAnsi"/>
-        </w:rPr>
-      </w:pPr>
-      <w:r>
-        <w:rPr>
-          <w:rFonts w:asciiTheme="majorHAnsi" w:hAnsiTheme="majorHAnsi" w:cstheme="majorHAnsi"/>
-        </w:rPr>
-        <w:t>- Tiempo de respuesta máximo permitido: 1.5 segundos</w:t>
-      </w:r>
-    </w:p>
-    <w:p>
-      <w:pPr>
-        <w:rPr>
-          <w:rFonts w:asciiTheme="majorHAnsi" w:hAnsiTheme="majorHAnsi" w:cstheme="majorHAnsi"/>
-        </w:rPr>
-      </w:pPr>
-      <w:r>
-        <w:rPr>
-          <w:rFonts w:asciiTheme="majorHAnsi" w:hAnsiTheme="majorHAnsi" w:cstheme="majorHAnsi"/>
-        </w:rPr>
-        <w:t>- Tasa de error aceptable: menor al 3%</w:t>
-      </w:r>
-    </w:p>
-    <w:p>
-      <w:pPr>
-        <w:rPr>
-          <w:rFonts w:asciiTheme="majorHAnsi" w:hAnsiTheme="majorHAnsi" w:cstheme="majorHAnsi"/>
-        </w:rPr>
-      </w:pPr>
-      <w:r>
-        <w:rPr>
-          <w:rFonts w:asciiTheme="majorHAnsi" w:hAnsiTheme="majorHAnsi" w:cstheme="majorHAnsi"/>
-        </w:rPr>
-        <w:t>- Capacidad esperada: mayor o igual a 20 TPS</w:t>
-      </w:r>
-    </w:p>
-    <w:p>
-      <w:pPr>
-        <w:rPr>
-          <w:rFonts w:asciiTheme="majorHAnsi" w:hAnsiTheme="majorHAnsi" w:cstheme="majorHAnsi"/>
-        </w:rPr>
-      </w:pPr>
-    </w:p>
-    <w:p>
-      <w:pPr>
-        <w:rPr>
-          <w:rFonts w:asciiTheme="majorHAnsi" w:hAnsiTheme="majorHAnsi" w:cstheme="majorHAnsi"/>
-        </w:rPr>
-      </w:pPr>
-      <w:r>
-        <w:rPr>
-          <w:rFonts w:asciiTheme="majorHAnsi" w:hAnsiTheme="majorHAnsi" w:cstheme="majorHAnsi"/>
-        </w:rPr>
-        <w:t>4. Resumen de resultados</w:t>
-      </w:r>
-    </w:p>
-    <w:p>
-      <w:pPr>
-        <w:rPr>
-          <w:rFonts w:asciiTheme="majorHAnsi" w:hAnsiTheme="majorHAnsi" w:cstheme="majorHAnsi"/>
-        </w:rPr>
-      </w:pPr>
-      <w:r>
-        <w:rPr>
-          <w:rFonts w:asciiTheme="majorHAnsi" w:hAnsiTheme="majorHAnsi" w:cstheme="majorHAnsi"/>
-        </w:rPr>
-        <w:t>- Total de requests ejecutados: 276,650</w:t>
-      </w:r>
-    </w:p>
-    <w:p>
-      <w:pPr>
-        <w:rPr>
-          <w:rFonts w:asciiTheme="majorHAnsi" w:hAnsiTheme="majorHAnsi" w:cstheme="majorHAnsi"/>
-        </w:rPr>
-      </w:pPr>
-      <w:r>
-        <w:rPr>
-          <w:rFonts w:asciiTheme="majorHAnsi" w:hAnsiTheme="majorHAnsi" w:cstheme="majorHAnsi"/>
-        </w:rPr>
-        <w:t>- TPS: 73.17 req/s</w:t>
-      </w:r>
-    </w:p>
-    <w:p>
-      <w:pPr>
-        <w:rPr>
-          <w:rFonts w:asciiTheme="majorHAnsi" w:hAnsiTheme="majorHAnsi" w:cstheme="majorHAnsi"/>
-        </w:rPr>
-      </w:pPr>
-      <w:r>
-        <w:rPr>
-          <w:rFonts w:asciiTheme="majorHAnsi" w:hAnsiTheme="majorHAnsi" w:cstheme="majorHAnsi"/>
-        </w:rPr>
-        <w:t>- Tiempo de respuesta promedio: 861.68 ms</w:t>
-      </w:r>
-    </w:p>
-    <w:p>
-      <w:pPr>
-        <w:rPr>
-          <w:rFonts w:asciiTheme="majorHAnsi" w:hAnsiTheme="majorHAnsi" w:cstheme="majorHAnsi"/>
-        </w:rPr>
-      </w:pPr>
-      <w:r>
-        <w:rPr>
-          <w:rFonts w:asciiTheme="majorHAnsi" w:hAnsiTheme="majorHAnsi" w:cstheme="majorHAnsi"/>
-        </w:rPr>
-        <w:t>- Percentil 90: 1.28 s</w:t>
-      </w:r>
-    </w:p>
-    <w:p>
-      <w:pPr>
-        <w:rPr>
-          <w:rFonts w:asciiTheme="majorHAnsi" w:hAnsiTheme="majorHAnsi" w:cstheme="majorHAnsi"/>
-        </w:rPr>
-      </w:pPr>
-      <w:r>
-        <w:rPr>
-          <w:rFonts w:asciiTheme="majorHAnsi" w:hAnsiTheme="majorHAnsi" w:cstheme="majorHAnsi"/>
-        </w:rPr>
-        <w:t>- Percentil 95: 1.57 s</w:t>
-      </w:r>
-    </w:p>
-    <w:p>
-      <w:pPr>
-        <w:rPr>
-          <w:rFonts w:asciiTheme="majorHAnsi" w:hAnsiTheme="majorHAnsi" w:cstheme="majorHAnsi"/>
-        </w:rPr>
-      </w:pPr>
-      <w:r>
-        <w:rPr>
-          <w:rFonts w:asciiTheme="majorHAnsi" w:hAnsiTheme="majorHAnsi" w:cstheme="majorHAnsi"/>
-        </w:rPr>
-        <w:t>- Tiempo máximo: 29.93 s</w:t>
-      </w:r>
-    </w:p>
-    <w:p>
-      <w:pPr>
-        <w:rPr>
-          <w:rFonts w:asciiTheme="majorHAnsi" w:hAnsiTheme="majorHAnsi" w:cstheme="majorHAnsi"/>
-        </w:rPr>
-      </w:pPr>
-      <w:r>
-        <w:rPr>
-          <w:rFonts w:asciiTheme="majorHAnsi" w:hAnsiTheme="majorHAnsi" w:cstheme="majorHAnsi"/>
-        </w:rPr>
-        <w:t>- Tasa de error: 2.44%</w:t>
-      </w:r>
-    </w:p>
-    <w:p>
-      <w:pPr>
-        <w:rPr>
-          <w:rFonts w:asciiTheme="majorHAnsi" w:hAnsiTheme="majorHAnsi" w:cstheme="majorHAnsi"/>
-        </w:rPr>
-      </w:pPr>
-      <w:r>
-        <w:rPr>
-          <w:rFonts w:asciiTheme="majorHAnsi" w:hAnsiTheme="majorHAnsi" w:cstheme="majorHAnsi"/>
-        </w:rPr>
-        <w:lastRenderedPageBreak/>
-        <w:t>- Usuarios virtuales máximos: 140</w:t>
-      </w:r>
-    </w:p>
-    <w:p>
-      <w:pPr>
-        <w:rPr>
-          <w:rFonts w:asciiTheme="majorHAnsi" w:hAnsiTheme="majorHAnsi" w:cstheme="majorHAnsi"/>
-        </w:rPr>
-      </w:pPr>
-    </w:p>
-    <w:p>
-      <w:pPr>
-        <w:rPr>
-          <w:rFonts w:asciiTheme="majorHAnsi" w:hAnsiTheme="majorHAnsi" w:cstheme="majorHAnsi"/>
-        </w:rPr>
-      </w:pPr>
-      <w:r>
-        <w:rPr>
-          <w:rFonts w:asciiTheme="majorHAnsi" w:hAnsiTheme="majorHAnsi" w:cstheme="majorHAnsi"/>
-        </w:rPr>
-        <w:t>5. Análisis de resultados</w:t>
-      </w:r>
-    </w:p>
-    <w:p>
-      <w:pPr>
-        <w:rPr>
-          <w:rFonts w:asciiTheme="majorHAnsi" w:hAnsiTheme="majorHAnsi" w:cstheme="majorHAnsi"/>
-        </w:rPr>
-      </w:pPr>
-      <w:r>
-        <w:rPr>
-          <w:rFonts w:asciiTheme="majorHAnsi" w:hAnsiTheme="majorHAnsi" w:cstheme="majorHAnsi"/>
-        </w:rPr>
-        <w:t>El sistema presenta un throughput promedio de 73.17 TPS, superando ampliamente el umbral mínimo requerido. El tiempo de respuesta promedio es adecuado; sin embargo, el percentil 95 supera el límite permitido, lo que indica degradación bajo carga alta. El tiempo máximo evidencia posibles cuellos de botella. La tasa de error se mantiene dentro del rango aceptable.</w:t>
-      </w:r>
-    </w:p>
-    <w:p>
-      <w:pPr>
-        <w:rPr>
-          <w:rFonts w:asciiTheme="majorHAnsi" w:hAnsiTheme="majorHAnsi" w:cstheme="majorHAnsi"/>
-        </w:rPr>
-      </w:pPr>
-    </w:p>
-    <w:p>
-      <w:pPr>
-        <w:rPr>
-          <w:rFonts w:asciiTheme="majorHAnsi" w:hAnsiTheme="majorHAnsi" w:cstheme="majorHAnsi"/>
-        </w:rPr>
-      </w:pPr>
-      <w:r>
-        <w:rPr>
-          <w:rFonts w:asciiTheme="majorHAnsi" w:hAnsiTheme="majorHAnsi" w:cstheme="majorHAnsi"/>
-        </w:rPr>
-        <w:t>6. Análisis del diagrama de monitoreo</w:t>
-      </w:r>
-    </w:p>
-    <w:p>
-      <w:pPr>
-        <w:rPr>
-          <w:rFonts w:asciiTheme="majorHAnsi" w:hAnsiTheme="majorHAnsi" w:cstheme="majorHAnsi"/>
-        </w:rPr>
-      </w:pPr>
-      <w:r>
-        <w:rPr>
-          <w:rFonts w:asciiTheme="majorHAnsi" w:hAnsiTheme="majorHAnsi" w:cstheme="majorHAnsi"/>
-        </w:rPr>
-        <w:t>El sistema alcanza aproximadamente 140 usuarios concurrentes, con un throughput estable entre 75 y 85 req/s. Se observa una caída abrupta en usuarios y TPS en un punto intermedio, seguida de recuperación. Esto sugiere variabilidad en el rendimiento y posible saturación.</w:t>
-      </w:r>
-    </w:p>
-    <w:p>
-      <w:pPr>
-        <w:rPr>
-          <w:rFonts w:asciiTheme="majorHAnsi" w:hAnsiTheme="majorHAnsi" w:cstheme="majorHAnsi"/>
-        </w:rPr>
-      </w:pPr>
-    </w:p>
-    <w:p>
-      <w:pPr>
-        <w:rPr>
-          <w:rFonts w:asciiTheme="majorHAnsi" w:hAnsiTheme="majorHAnsi" w:cstheme="majorHAnsi"/>
-        </w:rPr>
-      </w:pPr>
-      <w:r>
-        <w:rPr>
-          <w:rFonts w:asciiTheme="majorHAnsi" w:hAnsiTheme="majorHAnsi" w:cstheme="majorHAnsi"/>
-        </w:rPr>
-        <w:t>7. Hallazgos</w:t>
-      </w:r>
-    </w:p>
-    <w:p>
-      <w:pPr>
-        <w:rPr>
-          <w:rFonts w:asciiTheme="majorHAnsi" w:hAnsiTheme="majorHAnsi" w:cstheme="majorHAnsi"/>
-        </w:rPr>
-      </w:pPr>
-      <w:r>
-        <w:rPr>
-          <w:rFonts w:asciiTheme="majorHAnsi" w:hAnsiTheme="majorHAnsi" w:cstheme="majorHAnsi"/>
-        </w:rPr>
-        <w:t>- Cumple con el throughput requerido</w:t>
-      </w:r>
-    </w:p>
-    <w:p>
-      <w:pPr>
-        <w:rPr>
-          <w:rFonts w:asciiTheme="majorHAnsi" w:hAnsiTheme="majorHAnsi" w:cstheme="majorHAnsi"/>
-        </w:rPr>
-      </w:pPr>
-      <w:r>
-        <w:rPr>
-          <w:rFonts w:asciiTheme="majorHAnsi" w:hAnsiTheme="majorHAnsi" w:cstheme="majorHAnsi"/>
-        </w:rPr>
-        <w:t>- El p95 supera el tiempo permitido</w:t>
-      </w:r>
-    </w:p>
-    <w:p>
-      <w:pPr>
-        <w:rPr>
-          <w:rFonts w:asciiTheme="majorHAnsi" w:hAnsiTheme="majorHAnsi" w:cstheme="majorHAnsi"/>
-        </w:rPr>
-      </w:pPr>
-      <w:r>
-        <w:rPr>
-          <w:rFonts w:asciiTheme="majorHAnsi" w:hAnsiTheme="majorHAnsi" w:cstheme="majorHAnsi"/>
-        </w:rPr>
-        <w:t>- Existen outliers significativos</w:t>
-      </w:r>
-    </w:p>
-    <w:p>
-      <w:pPr>
-        <w:rPr>
-          <w:rFonts w:asciiTheme="majorHAnsi" w:hAnsiTheme="majorHAnsi" w:cstheme="majorHAnsi"/>
-        </w:rPr>
-      </w:pPr>
-      <w:r>
-        <w:rPr>
-          <w:rFonts w:asciiTheme="majorHAnsi" w:hAnsiTheme="majorHAnsi" w:cstheme="majorHAnsi"/>
-        </w:rPr>
-        <w:t>- La tasa de error es aceptable pero no ideal</w:t>
-      </w:r>
-    </w:p>
-    <w:p>
-      <w:pPr>
-        <w:rPr>
-          <w:rFonts w:asciiTheme="majorHAnsi" w:hAnsiTheme="majorHAnsi" w:cstheme="majorHAnsi"/>
-        </w:rPr>
-      </w:pPr>
-      <w:r>
-        <w:rPr>
-          <w:rFonts w:asciiTheme="majorHAnsi" w:hAnsiTheme="majorHAnsi" w:cstheme="majorHAnsi"/>
-        </w:rPr>
-        <w:t>- Hay inestabilidad en el comportamiento bajo carga</w:t>
-      </w:r>
-    </w:p>
-    <w:p>
-      <w:pPr>
-        <w:rPr>
-          <w:rFonts w:asciiTheme="majorHAnsi" w:hAnsiTheme="majorHAnsi" w:cstheme="majorHAnsi"/>
-        </w:rPr>
-      </w:pPr>
-    </w:p>
-    <w:p>
-      <w:pPr>
-        <w:rPr>
-          <w:rFonts w:asciiTheme="majorHAnsi" w:hAnsiTheme="majorHAnsi" w:cstheme="majorHAnsi"/>
-        </w:rPr>
-      </w:pPr>
-      <w:r>
-        <w:rPr>
-          <w:rFonts w:asciiTheme="majorHAnsi" w:hAnsiTheme="majorHAnsi" w:cstheme="majorHAnsi"/>
-        </w:rPr>
-        <w:t>8. Conclusiones</w:t>
-      </w:r>
-    </w:p>
-    <w:p>
-      <w:pPr>
-        <w:rPr>
-          <w:rFonts w:asciiTheme="majorHAnsi" w:hAnsiTheme="majorHAnsi" w:cstheme="majorHAnsi"/>
-        </w:rPr>
-      </w:pPr>
-      <w:r>
-        <w:rPr>
-          <w:rFonts w:asciiTheme="majorHAnsi" w:hAnsiTheme="majorHAnsi" w:cstheme="majorHAnsi"/>
-        </w:rPr>
-        <w:t>El sistema soporta la carga esperada pero presenta problemas de estabilidad en escenarios exigentes. Se requieren optimizaciones antes de producción.</w:t>
-      </w:r>
-    </w:p>
-    <w:p>
-      <w:pPr>
-        <w:rPr>
-          <w:rFonts w:asciiTheme="majorHAnsi" w:hAnsiTheme="majorHAnsi" w:cstheme="majorHAnsi"/>
-        </w:rPr>
-      </w:pPr>
-    </w:p>
-    <w:p>
-      <w:pPr>
-        <w:rPr>
-          <w:rFonts w:asciiTheme="majorHAnsi" w:hAnsiTheme="majorHAnsi" w:cstheme="majorHAnsi"/>
-        </w:rPr>
-      </w:pPr>
-      <w:r>
-        <w:rPr>
-          <w:rFonts w:asciiTheme="majorHAnsi" w:hAnsiTheme="majorHAnsi" w:cstheme="majorHAnsi"/>
-        </w:rPr>
-        <w:t>9. Recomendaciones</w:t>
-      </w:r>
-    </w:p>
-    <w:p>
-      <w:pPr>
-        <w:rPr>
-          <w:rFonts w:asciiTheme="majorHAnsi" w:hAnsiTheme="majorHAnsi" w:cstheme="majorHAnsi"/>
-        </w:rPr>
-      </w:pPr>
-      <w:r>
-        <w:rPr>
-          <w:rFonts w:asciiTheme="majorHAnsi" w:hAnsiTheme="majorHAnsi" w:cstheme="majorHAnsi"/>
-        </w:rPr>
-        <w:t>- Optimizar tiempos de respuesta</w:t>
-      </w:r>
-    </w:p>
-    <w:p>
-      <w:pPr>
-        <w:rPr>
-          <w:rFonts w:asciiTheme="majorHAnsi" w:hAnsiTheme="majorHAnsi" w:cstheme="majorHAnsi"/>
-        </w:rPr>
-      </w:pPr>
-      <w:r>
-        <w:rPr>
-          <w:rFonts w:asciiTheme="majorHAnsi" w:hAnsiTheme="majorHAnsi" w:cstheme="majorHAnsi"/>
-        </w:rPr>
-        <w:t>- Analizar cuellos de botella</w:t>
-      </w:r>
-    </w:p>
-    <w:p>
-      <w:pPr>
-        <w:rPr>
-          <w:rFonts w:asciiTheme="majorHAnsi" w:hAnsiTheme="majorHAnsi" w:cstheme="majorHAnsi"/>
-        </w:rPr>
-      </w:pPr>
-      <w:r>
-        <w:rPr>
-          <w:rFonts w:asciiTheme="majorHAnsi" w:hAnsiTheme="majorHAnsi" w:cstheme="majorHAnsi"/>
-        </w:rPr>
-        <w:t>- Revisar logs e infraestructura</w:t>
-      </w:r>
-    </w:p>
-    <w:p>
-      <w:pPr>
-        <w:rPr>
-          <w:rFonts w:asciiTheme="majorHAnsi" w:hAnsiTheme="majorHAnsi" w:cstheme="majorHAnsi"/>
-        </w:rPr>
-      </w:pPr>
-      <w:r>
-        <w:rPr>
-          <w:rFonts w:asciiTheme="majorHAnsi" w:hAnsiTheme="majorHAnsi" w:cstheme="majorHAnsi"/>
-        </w:rPr>
-        <w:lastRenderedPageBreak/>
-        <w:t>- Ejecutar pruebas de estrés</w:t>
-      </w:r>
-    </w:p>
-    <w:p>
-      <w:pPr>
-        <w:rPr>
-          <w:rFonts w:asciiTheme="majorHAnsi" w:hAnsiTheme="majorHAnsi" w:cstheme="majorHAnsi"/>
-        </w:rPr>
-      </w:pPr>
-      <w:r>
-        <w:rPr>
-          <w:rFonts w:asciiTheme="majorHAnsi" w:hAnsiTheme="majorHAnsi" w:cstheme="majorHAnsi"/>
-        </w:rPr>
-        <w:t>- Aumentar duración de pruebas</w:t>
-      </w:r>
-    </w:p>
-    <w:p>
-      <w:pPr>
-        <w:rPr>
-          <w:rFonts w:asciiTheme="majorHAnsi" w:hAnsiTheme="majorHAnsi" w:cstheme="majorHAnsi"/>
-        </w:rPr>
-      </w:pPr>
-      <w:r>
-        <w:rPr>
-          <w:rFonts w:asciiTheme="majorHAnsi" w:hAnsiTheme="majorHAnsi" w:cstheme="majorHAnsi"/>
-        </w:rPr>
-        <w:t>- Mejorar manejo de errores</w:t>
-      </w:r>
-    </w:p>
-    <w:p>
-      <w:pPr>
-        <w:rPr>
-          <w:rFonts w:asciiTheme="majorHAnsi" w:hAnsiTheme="majorHAnsi" w:cstheme="majorHAnsi"/>
-        </w:rPr>
-      </w:pPr>
     </w:p>
     <w:sectPr>
       <w:pgSz w:w="12240" w:h="15840"/>
-      <w:pgMar w:top="1440" w:right="1800" w:bottom="1440" w:left="1800" w:header="720" w:footer="720" w:gutter="0"/>
+      <w:pgMar w:top="1134" w:right="1247" w:bottom="1134" w:left="1247" w:header="720" w:footer="720" w:gutter="0"/>
       <w:cols w:space="720"/>
       <w:docGrid w:linePitch="360"/>
     </w:sectPr>
@@ -745,31 +1703,31 @@
       </w:rPr>
     </w:lvl>
   </w:abstractNum>
-  <w:num w:numId="1" w16cid:durableId="987636402">
+  <w:num w:numId="1" w16cid:durableId="1826240433">
     <w:abstractNumId w:val="8"/>
   </w:num>
-  <w:num w:numId="2" w16cid:durableId="443304869">
+  <w:num w:numId="2" w16cid:durableId="683096857">
     <w:abstractNumId w:val="6"/>
   </w:num>
-  <w:num w:numId="3" w16cid:durableId="1529248883">
+  <w:num w:numId="3" w16cid:durableId="51395745">
     <w:abstractNumId w:val="5"/>
   </w:num>
-  <w:num w:numId="4" w16cid:durableId="953903649">
+  <w:num w:numId="4" w16cid:durableId="1466896688">
     <w:abstractNumId w:val="4"/>
   </w:num>
-  <w:num w:numId="5" w16cid:durableId="1389301959">
+  <w:num w:numId="5" w16cid:durableId="1146168375">
     <w:abstractNumId w:val="7"/>
   </w:num>
-  <w:num w:numId="6" w16cid:durableId="1400639243">
+  <w:num w:numId="6" w16cid:durableId="366610002">
     <w:abstractNumId w:val="3"/>
   </w:num>
-  <w:num w:numId="7" w16cid:durableId="717096467">
+  <w:num w:numId="7" w16cid:durableId="628971279">
     <w:abstractNumId w:val="2"/>
   </w:num>
-  <w:num w:numId="8" w16cid:durableId="1040130290">
+  <w:num w:numId="8" w16cid:durableId="586311152">
     <w:abstractNumId w:val="1"/>
   </w:num>
-  <w:num w:numId="9" w16cid:durableId="855845464">
+  <w:num w:numId="9" w16cid:durableId="2110392714">
     <w:abstractNumId w:val="0"/>
   </w:num>
 </w:numbering>
@@ -1165,6 +2123,10 @@
     <w:name w:val="Normal"/>
     <w:qFormat/>
     <w:rsid w:val="00FC693F"/>
+    <w:rPr>
+      <w:rFonts w:ascii="Aptos" w:hAnsi="Aptos"/>
+      <w:sz w:val="21"/>
+    </w:rPr>
   </w:style>
   <w:style w:type="paragraph" w:styleId="Ttulo1">
     <w:name w:val="heading 1"/>
@@ -1184,7 +2146,7 @@
       <w:rFonts w:asciiTheme="majorHAnsi" w:eastAsiaTheme="majorEastAsia" w:hAnsiTheme="majorHAnsi" w:cstheme="majorBidi"/>
       <w:b/>
       <w:bCs/>
-      <w:color w:val="365F91" w:themeColor="accent1" w:themeShade="BF"/>
+      <w:color w:val="124D64"/>
       <w:sz w:val="28"/>
       <w:szCs w:val="28"/>
     </w:rPr>
@@ -1208,8 +2170,8 @@
       <w:rFonts w:asciiTheme="majorHAnsi" w:eastAsiaTheme="majorEastAsia" w:hAnsiTheme="majorHAnsi" w:cstheme="majorBidi"/>
       <w:b/>
       <w:bCs/>
-      <w:color w:val="4F81BD" w:themeColor="accent1"/>
-      <w:sz w:val="26"/>
+      <w:color w:val="124D64"/>
+      <w:sz w:val="23"/>
       <w:szCs w:val="26"/>
     </w:rPr>
   </w:style>
@@ -1515,10 +2477,11 @@
     </w:pPr>
     <w:rPr>
       <w:rFonts w:asciiTheme="majorHAnsi" w:eastAsiaTheme="majorEastAsia" w:hAnsiTheme="majorHAnsi" w:cstheme="majorBidi"/>
-      <w:color w:val="17365D" w:themeColor="text2" w:themeShade="BF"/>
+      <w:b/>
+      <w:color w:val="124D64"/>
       <w:spacing w:val="5"/>
       <w:kern w:val="28"/>
-      <w:sz w:val="52"/>
+      <w:sz w:val="40"/>
       <w:szCs w:val="52"/>
     </w:rPr>
   </w:style>

</xml_diff>